<commit_message>
first assignment updates for my thoughts on the LLM output
</commit_message>
<xml_diff>
--- a/homework/hw_assignment_1.docx
+++ b/homework/hw_assignment_1.docx
@@ -41,7 +41,21 @@
         </w:drawing>
       </w:r>
     </w:p>
-    <w:p/>
+    <w:p>
+      <w:pPr>
+        <w:rPr>
+          <w:sz w:val="21"/>
+          <w:szCs w:val="21"/>
+        </w:rPr>
+      </w:pPr>
+      <w:r>
+        <w:rPr>
+          <w:sz w:val="21"/>
+          <w:szCs w:val="21"/>
+        </w:rPr>
+        <w:t>Verbose, but clear response</w:t>
+      </w:r>
+    </w:p>
     <w:p/>
     <w:p>
       <w:pPr>
@@ -88,6 +102,17 @@
             </a:graphic>
           </wp:inline>
         </w:drawing>
+      </w:r>
+    </w:p>
+    <w:p>
+      <w:pPr>
+        <w:tabs>
+          <w:tab w:val="left" w:pos="6696"/>
+        </w:tabs>
+      </w:pPr>
+      <w:r>
+        <w:lastRenderedPageBreak/>
+        <w:t>Not concise like the prompt states – would need iteration</w:t>
       </w:r>
     </w:p>
     <w:p>
@@ -147,6 +172,9 @@
           <w:tab w:val="left" w:pos="6696"/>
         </w:tabs>
       </w:pPr>
+      <w:r>
+        <w:t>Creative and passes the vibe check</w:t>
+      </w:r>
     </w:p>
     <w:p>
       <w:pPr>
@@ -198,6 +226,12 @@
           <w:tab w:val="left" w:pos="6696"/>
         </w:tabs>
       </w:pPr>
+      <w:r>
+        <w:t>Provides sound reasoning.</w:t>
+      </w:r>
+      <w:r>
+        <w:t xml:space="preserve"> Would like to learn about the math benchmarks of LLMs and how well LLMs as judges perform in mathematical tests. </w:t>
+      </w:r>
     </w:p>
     <w:p>
       <w:pPr>
@@ -242,6 +276,16 @@
             </a:graphic>
           </wp:inline>
         </w:drawing>
+      </w:r>
+    </w:p>
+    <w:p>
+      <w:pPr>
+        <w:tabs>
+          <w:tab w:val="left" w:pos="6696"/>
+        </w:tabs>
+      </w:pPr>
+      <w:r>
+        <w:t>Able to complete the task – vibe check passed</w:t>
       </w:r>
     </w:p>
     <w:sectPr>

</xml_diff>

<commit_message>
updated responses after changing the prompt
</commit_message>
<xml_diff>
--- a/homework/hw_assignment_1.docx
+++ b/homework/hw_assignment_1.docx
@@ -4,6 +4,14 @@
   <w:body>
     <w:p>
       <w:r>
+        <w:t>Before prompt updates</w:t>
+      </w:r>
+    </w:p>
+    <w:p>
+      <w:r>
+        <w:rPr>
+          <w:noProof/>
+        </w:rPr>
         <w:drawing>
           <wp:inline distT="0" distB="0" distL="0" distR="0" wp14:anchorId="75A8BCF7" wp14:editId="47007504">
             <wp:extent cx="5943600" cy="3185160"/>
@@ -64,9 +72,13 @@
         </w:tabs>
       </w:pPr>
       <w:r>
+        <w:lastRenderedPageBreak/>
         <w:tab/>
       </w:r>
       <w:r>
+        <w:rPr>
+          <w:noProof/>
+        </w:rPr>
         <w:drawing>
           <wp:inline distT="0" distB="0" distL="0" distR="0" wp14:anchorId="4769BBFE" wp14:editId="0B95F52C">
             <wp:extent cx="5943600" cy="3837940"/>
@@ -111,7 +123,6 @@
         </w:tabs>
       </w:pPr>
       <w:r>
-        <w:lastRenderedPageBreak/>
         <w:t>Not concise like the prompt states – would need iteration</w:t>
       </w:r>
     </w:p>
@@ -129,6 +140,9 @@
         </w:tabs>
       </w:pPr>
       <w:r>
+        <w:rPr>
+          <w:noProof/>
+        </w:rPr>
         <w:drawing>
           <wp:inline distT="0" distB="0" distL="0" distR="0" wp14:anchorId="63835204" wp14:editId="182686C2">
             <wp:extent cx="5943600" cy="2294255"/>
@@ -183,6 +197,10 @@
         </w:tabs>
       </w:pPr>
       <w:r>
+        <w:rPr>
+          <w:noProof/>
+        </w:rPr>
+        <w:lastRenderedPageBreak/>
         <w:drawing>
           <wp:inline distT="0" distB="0" distL="0" distR="0" wp14:anchorId="4997CC16" wp14:editId="6DC1EAED">
             <wp:extent cx="5943600" cy="2230120"/>
@@ -227,10 +245,7 @@
         </w:tabs>
       </w:pPr>
       <w:r>
-        <w:t>Provides sound reasoning.</w:t>
-      </w:r>
-      <w:r>
-        <w:t xml:space="preserve"> Would like to learn about the math benchmarks of LLMs and how well LLMs as judges perform in mathematical tests. </w:t>
+        <w:t xml:space="preserve">Provides sound reasoning. Would like to learn about the math benchmarks of LLMs and how well LLMs as judges perform in mathematical tests. </w:t>
       </w:r>
     </w:p>
     <w:p>
@@ -240,7 +255,9 @@
         </w:tabs>
       </w:pPr>
       <w:r>
-        <w:lastRenderedPageBreak/>
+        <w:rPr>
+          <w:noProof/>
+        </w:rPr>
         <w:drawing>
           <wp:inline distT="0" distB="0" distL="0" distR="0" wp14:anchorId="647BE482" wp14:editId="262929AB">
             <wp:extent cx="5943600" cy="3595370"/>
@@ -286,6 +303,1019 @@
       </w:pPr>
       <w:r>
         <w:t>Able to complete the task – vibe check passed</w:t>
+      </w:r>
+    </w:p>
+    <w:p>
+      <w:pPr>
+        <w:tabs>
+          <w:tab w:val="left" w:pos="6696"/>
+        </w:tabs>
+      </w:pPr>
+    </w:p>
+    <w:p>
+      <w:pPr>
+        <w:tabs>
+          <w:tab w:val="left" w:pos="6696"/>
+        </w:tabs>
+      </w:pPr>
+    </w:p>
+    <w:p>
+      <w:pPr>
+        <w:tabs>
+          <w:tab w:val="left" w:pos="6696"/>
+        </w:tabs>
+      </w:pPr>
+      <w:r>
+        <w:t>After system prompt updates:</w:t>
+      </w:r>
+    </w:p>
+    <w:p>
+      <w:pPr>
+        <w:shd w:val="clear" w:color="auto" w:fill="181818"/>
+        <w:spacing w:after="0" w:line="270" w:lineRule="atLeast"/>
+        <w:rPr>
+          <w:rFonts w:ascii="Menlo" w:eastAsia="Times New Roman" w:hAnsi="Menlo" w:cs="Menlo"/>
+          <w:color w:val="D6D6DD"/>
+          <w:kern w:val="0"/>
+          <w:sz w:val="18"/>
+          <w:szCs w:val="18"/>
+          <w14:ligatures w14:val="none"/>
+        </w:rPr>
+      </w:pPr>
+      <w:proofErr w:type="spellStart"/>
+      <w:r>
+        <w:rPr>
+          <w:rFonts w:ascii="Menlo" w:eastAsia="Times New Roman" w:hAnsi="Menlo" w:cs="Menlo"/>
+          <w:color w:val="D6D6DD"/>
+          <w:kern w:val="0"/>
+          <w:sz w:val="18"/>
+          <w:szCs w:val="18"/>
+          <w14:ligatures w14:val="none"/>
+        </w:rPr>
+        <w:lastRenderedPageBreak/>
+        <w:t>system_template</w:t>
+      </w:r>
+      <w:proofErr w:type="spellEnd"/>
+      <w:r>
+        <w:rPr>
+          <w:rFonts w:ascii="Menlo" w:eastAsia="Times New Roman" w:hAnsi="Menlo" w:cs="Menlo"/>
+          <w:color w:val="D6D6DD"/>
+          <w:kern w:val="0"/>
+          <w:sz w:val="18"/>
+          <w:szCs w:val="18"/>
+          <w14:ligatures w14:val="none"/>
+        </w:rPr>
+        <w:t xml:space="preserve"> = </w:t>
+      </w:r>
+      <w:r>
+        <w:rPr>
+          <w:rFonts w:ascii="Menlo" w:eastAsia="Times New Roman" w:hAnsi="Menlo" w:cs="Menlo"/>
+          <w:color w:val="E394DC"/>
+          <w:kern w:val="0"/>
+          <w:sz w:val="18"/>
+          <w:szCs w:val="18"/>
+          <w14:ligatures w14:val="none"/>
+        </w:rPr>
+        <w:t>"""You are a versatile educational assistant designed to provide clear, structured, and engaging responses. Follow these guidelines based on the type of question:</w:t>
+      </w:r>
+    </w:p>
+    <w:p>
+      <w:pPr>
+        <w:shd w:val="clear" w:color="auto" w:fill="181818"/>
+        <w:spacing w:after="0" w:line="270" w:lineRule="atLeast"/>
+        <w:rPr>
+          <w:rFonts w:ascii="Menlo" w:eastAsia="Times New Roman" w:hAnsi="Menlo" w:cs="Menlo"/>
+          <w:color w:val="D6D6DD"/>
+          <w:kern w:val="0"/>
+          <w:sz w:val="18"/>
+          <w:szCs w:val="18"/>
+          <w14:ligatures w14:val="none"/>
+        </w:rPr>
+      </w:pPr>
+    </w:p>
+    <w:p>
+      <w:pPr>
+        <w:shd w:val="clear" w:color="auto" w:fill="181818"/>
+        <w:spacing w:after="0" w:line="270" w:lineRule="atLeast"/>
+        <w:rPr>
+          <w:rFonts w:ascii="Menlo" w:eastAsia="Times New Roman" w:hAnsi="Menlo" w:cs="Menlo"/>
+          <w:color w:val="D6D6DD"/>
+          <w:kern w:val="0"/>
+          <w:sz w:val="18"/>
+          <w:szCs w:val="18"/>
+          <w14:ligatures w14:val="none"/>
+        </w:rPr>
+      </w:pPr>
+      <w:r>
+        <w:rPr>
+          <w:rFonts w:ascii="Menlo" w:eastAsia="Times New Roman" w:hAnsi="Menlo" w:cs="Menlo"/>
+          <w:color w:val="E394DC"/>
+          <w:kern w:val="0"/>
+          <w:sz w:val="18"/>
+          <w:szCs w:val="18"/>
+          <w14:ligatures w14:val="none"/>
+        </w:rPr>
+        <w:t>For explanatory questions (e.g., concepts, theories):</w:t>
+      </w:r>
+    </w:p>
+    <w:p>
+      <w:pPr>
+        <w:shd w:val="clear" w:color="auto" w:fill="181818"/>
+        <w:spacing w:after="0" w:line="270" w:lineRule="atLeast"/>
+        <w:rPr>
+          <w:rFonts w:ascii="Menlo" w:eastAsia="Times New Roman" w:hAnsi="Menlo" w:cs="Menlo"/>
+          <w:color w:val="D6D6DD"/>
+          <w:kern w:val="0"/>
+          <w:sz w:val="18"/>
+          <w:szCs w:val="18"/>
+          <w14:ligatures w14:val="none"/>
+        </w:rPr>
+      </w:pPr>
+      <w:r>
+        <w:rPr>
+          <w:rFonts w:ascii="Menlo" w:eastAsia="Times New Roman" w:hAnsi="Menlo" w:cs="Menlo"/>
+          <w:color w:val="E394DC"/>
+          <w:kern w:val="0"/>
+          <w:sz w:val="18"/>
+          <w:szCs w:val="18"/>
+          <w14:ligatures w14:val="none"/>
+        </w:rPr>
+        <w:t>- Start with a simple, relatable analogy</w:t>
+      </w:r>
+    </w:p>
+    <w:p>
+      <w:pPr>
+        <w:shd w:val="clear" w:color="auto" w:fill="181818"/>
+        <w:spacing w:after="0" w:line="270" w:lineRule="atLeast"/>
+        <w:rPr>
+          <w:rFonts w:ascii="Menlo" w:eastAsia="Times New Roman" w:hAnsi="Menlo" w:cs="Menlo"/>
+          <w:color w:val="D6D6DD"/>
+          <w:kern w:val="0"/>
+          <w:sz w:val="18"/>
+          <w:szCs w:val="18"/>
+          <w14:ligatures w14:val="none"/>
+        </w:rPr>
+      </w:pPr>
+      <w:r>
+        <w:rPr>
+          <w:rFonts w:ascii="Menlo" w:eastAsia="Times New Roman" w:hAnsi="Menlo" w:cs="Menlo"/>
+          <w:color w:val="E394DC"/>
+          <w:kern w:val="0"/>
+          <w:sz w:val="18"/>
+          <w:szCs w:val="18"/>
+          <w14:ligatures w14:val="none"/>
+        </w:rPr>
+        <w:t>- Break down complex ideas into digestible parts</w:t>
+      </w:r>
+    </w:p>
+    <w:p>
+      <w:pPr>
+        <w:shd w:val="clear" w:color="auto" w:fill="181818"/>
+        <w:spacing w:after="0" w:line="270" w:lineRule="atLeast"/>
+        <w:rPr>
+          <w:rFonts w:ascii="Menlo" w:eastAsia="Times New Roman" w:hAnsi="Menlo" w:cs="Menlo"/>
+          <w:color w:val="D6D6DD"/>
+          <w:kern w:val="0"/>
+          <w:sz w:val="18"/>
+          <w:szCs w:val="18"/>
+          <w14:ligatures w14:val="none"/>
+        </w:rPr>
+      </w:pPr>
+      <w:r>
+        <w:rPr>
+          <w:rFonts w:ascii="Menlo" w:eastAsia="Times New Roman" w:hAnsi="Menlo" w:cs="Menlo"/>
+          <w:color w:val="E394DC"/>
+          <w:kern w:val="0"/>
+          <w:sz w:val="18"/>
+          <w:szCs w:val="18"/>
+          <w14:ligatures w14:val="none"/>
+        </w:rPr>
+        <w:t>- Use real-world examples</w:t>
+      </w:r>
+    </w:p>
+    <w:p>
+      <w:pPr>
+        <w:shd w:val="clear" w:color="auto" w:fill="181818"/>
+        <w:spacing w:after="0" w:line="270" w:lineRule="atLeast"/>
+        <w:rPr>
+          <w:rFonts w:ascii="Menlo" w:eastAsia="Times New Roman" w:hAnsi="Menlo" w:cs="Menlo"/>
+          <w:color w:val="D6D6DD"/>
+          <w:kern w:val="0"/>
+          <w:sz w:val="18"/>
+          <w:szCs w:val="18"/>
+          <w14:ligatures w14:val="none"/>
+        </w:rPr>
+      </w:pPr>
+      <w:r>
+        <w:rPr>
+          <w:rFonts w:ascii="Menlo" w:eastAsia="Times New Roman" w:hAnsi="Menlo" w:cs="Menlo"/>
+          <w:color w:val="E394DC"/>
+          <w:kern w:val="0"/>
+          <w:sz w:val="18"/>
+          <w:szCs w:val="18"/>
+          <w14:ligatures w14:val="none"/>
+        </w:rPr>
+        <w:t xml:space="preserve">- Conclude with </w:t>
+      </w:r>
+      <w:proofErr w:type="gramStart"/>
+      <w:r>
+        <w:rPr>
+          <w:rFonts w:ascii="Menlo" w:eastAsia="Times New Roman" w:hAnsi="Menlo" w:cs="Menlo"/>
+          <w:color w:val="E394DC"/>
+          <w:kern w:val="0"/>
+          <w:sz w:val="18"/>
+          <w:szCs w:val="18"/>
+          <w14:ligatures w14:val="none"/>
+        </w:rPr>
+        <w:t>a brief summary</w:t>
+      </w:r>
+      <w:proofErr w:type="gramEnd"/>
+    </w:p>
+    <w:p>
+      <w:pPr>
+        <w:shd w:val="clear" w:color="auto" w:fill="181818"/>
+        <w:spacing w:after="0" w:line="270" w:lineRule="atLeast"/>
+        <w:rPr>
+          <w:rFonts w:ascii="Menlo" w:eastAsia="Times New Roman" w:hAnsi="Menlo" w:cs="Menlo"/>
+          <w:color w:val="D6D6DD"/>
+          <w:kern w:val="0"/>
+          <w:sz w:val="18"/>
+          <w:szCs w:val="18"/>
+          <w14:ligatures w14:val="none"/>
+        </w:rPr>
+      </w:pPr>
+    </w:p>
+    <w:p>
+      <w:pPr>
+        <w:shd w:val="clear" w:color="auto" w:fill="181818"/>
+        <w:spacing w:after="0" w:line="270" w:lineRule="atLeast"/>
+        <w:rPr>
+          <w:rFonts w:ascii="Menlo" w:eastAsia="Times New Roman" w:hAnsi="Menlo" w:cs="Menlo"/>
+          <w:color w:val="D6D6DD"/>
+          <w:kern w:val="0"/>
+          <w:sz w:val="18"/>
+          <w:szCs w:val="18"/>
+          <w14:ligatures w14:val="none"/>
+        </w:rPr>
+      </w:pPr>
+      <w:r>
+        <w:rPr>
+          <w:rFonts w:ascii="Menlo" w:eastAsia="Times New Roman" w:hAnsi="Menlo" w:cs="Menlo"/>
+          <w:color w:val="E394DC"/>
+          <w:kern w:val="0"/>
+          <w:sz w:val="18"/>
+          <w:szCs w:val="18"/>
+          <w14:ligatures w14:val="none"/>
+        </w:rPr>
+        <w:t>For reading comprehension and analysis:</w:t>
+      </w:r>
+    </w:p>
+    <w:p>
+      <w:pPr>
+        <w:shd w:val="clear" w:color="auto" w:fill="181818"/>
+        <w:spacing w:after="0" w:line="270" w:lineRule="atLeast"/>
+        <w:rPr>
+          <w:rFonts w:ascii="Menlo" w:eastAsia="Times New Roman" w:hAnsi="Menlo" w:cs="Menlo"/>
+          <w:color w:val="D6D6DD"/>
+          <w:kern w:val="0"/>
+          <w:sz w:val="18"/>
+          <w:szCs w:val="18"/>
+          <w14:ligatures w14:val="none"/>
+        </w:rPr>
+      </w:pPr>
+      <w:r>
+        <w:rPr>
+          <w:rFonts w:ascii="Menlo" w:eastAsia="Times New Roman" w:hAnsi="Menlo" w:cs="Menlo"/>
+          <w:color w:val="E394DC"/>
+          <w:kern w:val="0"/>
+          <w:sz w:val="18"/>
+          <w:szCs w:val="18"/>
+          <w14:ligatures w14:val="none"/>
+        </w:rPr>
+        <w:t>- Present key points in a structured format</w:t>
+      </w:r>
+    </w:p>
+    <w:p>
+      <w:pPr>
+        <w:shd w:val="clear" w:color="auto" w:fill="181818"/>
+        <w:spacing w:after="0" w:line="270" w:lineRule="atLeast"/>
+        <w:rPr>
+          <w:rFonts w:ascii="Menlo" w:eastAsia="Times New Roman" w:hAnsi="Menlo" w:cs="Menlo"/>
+          <w:color w:val="D6D6DD"/>
+          <w:kern w:val="0"/>
+          <w:sz w:val="18"/>
+          <w:szCs w:val="18"/>
+          <w14:ligatures w14:val="none"/>
+        </w:rPr>
+      </w:pPr>
+      <w:r>
+        <w:rPr>
+          <w:rFonts w:ascii="Menlo" w:eastAsia="Times New Roman" w:hAnsi="Menlo" w:cs="Menlo"/>
+          <w:color w:val="E394DC"/>
+          <w:kern w:val="0"/>
+          <w:sz w:val="18"/>
+          <w:szCs w:val="18"/>
+          <w14:ligatures w14:val="none"/>
+        </w:rPr>
+        <w:t>- Identify main themes and supporting details</w:t>
+      </w:r>
+    </w:p>
+    <w:p>
+      <w:pPr>
+        <w:shd w:val="clear" w:color="auto" w:fill="181818"/>
+        <w:spacing w:after="0" w:line="270" w:lineRule="atLeast"/>
+        <w:rPr>
+          <w:rFonts w:ascii="Menlo" w:eastAsia="Times New Roman" w:hAnsi="Menlo" w:cs="Menlo"/>
+          <w:color w:val="D6D6DD"/>
+          <w:kern w:val="0"/>
+          <w:sz w:val="18"/>
+          <w:szCs w:val="18"/>
+          <w14:ligatures w14:val="none"/>
+        </w:rPr>
+      </w:pPr>
+      <w:r>
+        <w:rPr>
+          <w:rFonts w:ascii="Menlo" w:eastAsia="Times New Roman" w:hAnsi="Menlo" w:cs="Menlo"/>
+          <w:color w:val="E394DC"/>
+          <w:kern w:val="0"/>
+          <w:sz w:val="18"/>
+          <w:szCs w:val="18"/>
+          <w14:ligatures w14:val="none"/>
+        </w:rPr>
+        <w:t>- Connect ideas logically</w:t>
+      </w:r>
+    </w:p>
+    <w:p>
+      <w:pPr>
+        <w:shd w:val="clear" w:color="auto" w:fill="181818"/>
+        <w:spacing w:after="0" w:line="270" w:lineRule="atLeast"/>
+        <w:rPr>
+          <w:rFonts w:ascii="Menlo" w:eastAsia="Times New Roman" w:hAnsi="Menlo" w:cs="Menlo"/>
+          <w:color w:val="D6D6DD"/>
+          <w:kern w:val="0"/>
+          <w:sz w:val="18"/>
+          <w:szCs w:val="18"/>
+          <w14:ligatures w14:val="none"/>
+        </w:rPr>
+      </w:pPr>
+      <w:r>
+        <w:rPr>
+          <w:rFonts w:ascii="Menlo" w:eastAsia="Times New Roman" w:hAnsi="Menlo" w:cs="Menlo"/>
+          <w:color w:val="E394DC"/>
+          <w:kern w:val="0"/>
+          <w:sz w:val="18"/>
+          <w:szCs w:val="18"/>
+          <w14:ligatures w14:val="none"/>
+        </w:rPr>
+        <w:t>- Provide a concise summary</w:t>
+      </w:r>
+    </w:p>
+    <w:p>
+      <w:pPr>
+        <w:shd w:val="clear" w:color="auto" w:fill="181818"/>
+        <w:spacing w:after="0" w:line="270" w:lineRule="atLeast"/>
+        <w:rPr>
+          <w:rFonts w:ascii="Menlo" w:eastAsia="Times New Roman" w:hAnsi="Menlo" w:cs="Menlo"/>
+          <w:color w:val="D6D6DD"/>
+          <w:kern w:val="0"/>
+          <w:sz w:val="18"/>
+          <w:szCs w:val="18"/>
+          <w14:ligatures w14:val="none"/>
+        </w:rPr>
+      </w:pPr>
+    </w:p>
+    <w:p>
+      <w:pPr>
+        <w:shd w:val="clear" w:color="auto" w:fill="181818"/>
+        <w:spacing w:after="0" w:line="270" w:lineRule="atLeast"/>
+        <w:rPr>
+          <w:rFonts w:ascii="Menlo" w:eastAsia="Times New Roman" w:hAnsi="Menlo" w:cs="Menlo"/>
+          <w:color w:val="D6D6DD"/>
+          <w:kern w:val="0"/>
+          <w:sz w:val="18"/>
+          <w:szCs w:val="18"/>
+          <w14:ligatures w14:val="none"/>
+        </w:rPr>
+      </w:pPr>
+      <w:r>
+        <w:rPr>
+          <w:rFonts w:ascii="Menlo" w:eastAsia="Times New Roman" w:hAnsi="Menlo" w:cs="Menlo"/>
+          <w:color w:val="E394DC"/>
+          <w:kern w:val="0"/>
+          <w:sz w:val="18"/>
+          <w:szCs w:val="18"/>
+          <w14:ligatures w14:val="none"/>
+        </w:rPr>
+        <w:t>For creative writing tasks:</w:t>
+      </w:r>
+    </w:p>
+    <w:p>
+      <w:pPr>
+        <w:shd w:val="clear" w:color="auto" w:fill="181818"/>
+        <w:spacing w:after="0" w:line="270" w:lineRule="atLeast"/>
+        <w:rPr>
+          <w:rFonts w:ascii="Menlo" w:eastAsia="Times New Roman" w:hAnsi="Menlo" w:cs="Menlo"/>
+          <w:color w:val="D6D6DD"/>
+          <w:kern w:val="0"/>
+          <w:sz w:val="18"/>
+          <w:szCs w:val="18"/>
+          <w14:ligatures w14:val="none"/>
+        </w:rPr>
+      </w:pPr>
+      <w:r>
+        <w:rPr>
+          <w:rFonts w:ascii="Menlo" w:eastAsia="Times New Roman" w:hAnsi="Menlo" w:cs="Menlo"/>
+          <w:color w:val="E394DC"/>
+          <w:kern w:val="0"/>
+          <w:sz w:val="18"/>
+          <w:szCs w:val="18"/>
+          <w14:ligatures w14:val="none"/>
+        </w:rPr>
+        <w:t>- Focus on vivid, descriptive language</w:t>
+      </w:r>
+    </w:p>
+    <w:p>
+      <w:pPr>
+        <w:shd w:val="clear" w:color="auto" w:fill="181818"/>
+        <w:spacing w:after="0" w:line="270" w:lineRule="atLeast"/>
+        <w:rPr>
+          <w:rFonts w:ascii="Menlo" w:eastAsia="Times New Roman" w:hAnsi="Menlo" w:cs="Menlo"/>
+          <w:color w:val="D6D6DD"/>
+          <w:kern w:val="0"/>
+          <w:sz w:val="18"/>
+          <w:szCs w:val="18"/>
+          <w14:ligatures w14:val="none"/>
+        </w:rPr>
+      </w:pPr>
+      <w:r>
+        <w:rPr>
+          <w:rFonts w:ascii="Menlo" w:eastAsia="Times New Roman" w:hAnsi="Menlo" w:cs="Menlo"/>
+          <w:color w:val="E394DC"/>
+          <w:kern w:val="0"/>
+          <w:sz w:val="18"/>
+          <w:szCs w:val="18"/>
+          <w14:ligatures w14:val="none"/>
+        </w:rPr>
+        <w:t>- Maintain a clear narrative structure</w:t>
+      </w:r>
+    </w:p>
+    <w:p>
+      <w:pPr>
+        <w:shd w:val="clear" w:color="auto" w:fill="181818"/>
+        <w:spacing w:after="0" w:line="270" w:lineRule="atLeast"/>
+        <w:rPr>
+          <w:rFonts w:ascii="Menlo" w:eastAsia="Times New Roman" w:hAnsi="Menlo" w:cs="Menlo"/>
+          <w:color w:val="D6D6DD"/>
+          <w:kern w:val="0"/>
+          <w:sz w:val="18"/>
+          <w:szCs w:val="18"/>
+          <w14:ligatures w14:val="none"/>
+        </w:rPr>
+      </w:pPr>
+      <w:r>
+        <w:rPr>
+          <w:rFonts w:ascii="Menlo" w:eastAsia="Times New Roman" w:hAnsi="Menlo" w:cs="Menlo"/>
+          <w:color w:val="E394DC"/>
+          <w:kern w:val="0"/>
+          <w:sz w:val="18"/>
+          <w:szCs w:val="18"/>
+          <w14:ligatures w14:val="none"/>
+        </w:rPr>
+        <w:t>- Develop engaging characters and settings</w:t>
+      </w:r>
+    </w:p>
+    <w:p>
+      <w:pPr>
+        <w:shd w:val="clear" w:color="auto" w:fill="181818"/>
+        <w:spacing w:after="0" w:line="270" w:lineRule="atLeast"/>
+        <w:rPr>
+          <w:rFonts w:ascii="Menlo" w:eastAsia="Times New Roman" w:hAnsi="Menlo" w:cs="Menlo"/>
+          <w:color w:val="D6D6DD"/>
+          <w:kern w:val="0"/>
+          <w:sz w:val="18"/>
+          <w:szCs w:val="18"/>
+          <w14:ligatures w14:val="none"/>
+        </w:rPr>
+      </w:pPr>
+      <w:r>
+        <w:rPr>
+          <w:rFonts w:ascii="Menlo" w:eastAsia="Times New Roman" w:hAnsi="Menlo" w:cs="Menlo"/>
+          <w:color w:val="E394DC"/>
+          <w:kern w:val="0"/>
+          <w:sz w:val="18"/>
+          <w:szCs w:val="18"/>
+          <w14:ligatures w14:val="none"/>
+        </w:rPr>
+        <w:t>- Stay within word limits</w:t>
+      </w:r>
+    </w:p>
+    <w:p>
+      <w:pPr>
+        <w:shd w:val="clear" w:color="auto" w:fill="181818"/>
+        <w:spacing w:after="0" w:line="270" w:lineRule="atLeast"/>
+        <w:rPr>
+          <w:rFonts w:ascii="Menlo" w:eastAsia="Times New Roman" w:hAnsi="Menlo" w:cs="Menlo"/>
+          <w:color w:val="D6D6DD"/>
+          <w:kern w:val="0"/>
+          <w:sz w:val="18"/>
+          <w:szCs w:val="18"/>
+          <w14:ligatures w14:val="none"/>
+        </w:rPr>
+      </w:pPr>
+      <w:r>
+        <w:rPr>
+          <w:rFonts w:ascii="Menlo" w:eastAsia="Times New Roman" w:hAnsi="Menlo" w:cs="Menlo"/>
+          <w:color w:val="E394DC"/>
+          <w:kern w:val="0"/>
+          <w:sz w:val="18"/>
+          <w:szCs w:val="18"/>
+          <w14:ligatures w14:val="none"/>
+        </w:rPr>
+        <w:t>- End with a meaningful conclusion</w:t>
+      </w:r>
+    </w:p>
+    <w:p>
+      <w:pPr>
+        <w:shd w:val="clear" w:color="auto" w:fill="181818"/>
+        <w:spacing w:after="0" w:line="270" w:lineRule="atLeast"/>
+        <w:rPr>
+          <w:rFonts w:ascii="Menlo" w:eastAsia="Times New Roman" w:hAnsi="Menlo" w:cs="Menlo"/>
+          <w:color w:val="D6D6DD"/>
+          <w:kern w:val="0"/>
+          <w:sz w:val="18"/>
+          <w:szCs w:val="18"/>
+          <w14:ligatures w14:val="none"/>
+        </w:rPr>
+      </w:pPr>
+    </w:p>
+    <w:p>
+      <w:pPr>
+        <w:shd w:val="clear" w:color="auto" w:fill="181818"/>
+        <w:spacing w:after="0" w:line="270" w:lineRule="atLeast"/>
+        <w:rPr>
+          <w:rFonts w:ascii="Menlo" w:eastAsia="Times New Roman" w:hAnsi="Menlo" w:cs="Menlo"/>
+          <w:color w:val="D6D6DD"/>
+          <w:kern w:val="0"/>
+          <w:sz w:val="18"/>
+          <w:szCs w:val="18"/>
+          <w14:ligatures w14:val="none"/>
+        </w:rPr>
+      </w:pPr>
+      <w:r>
+        <w:rPr>
+          <w:rFonts w:ascii="Menlo" w:eastAsia="Times New Roman" w:hAnsi="Menlo" w:cs="Menlo"/>
+          <w:color w:val="E394DC"/>
+          <w:kern w:val="0"/>
+          <w:sz w:val="18"/>
+          <w:szCs w:val="18"/>
+          <w14:ligatures w14:val="none"/>
+        </w:rPr>
+        <w:t>For mathematical problems:</w:t>
+      </w:r>
+    </w:p>
+    <w:p>
+      <w:pPr>
+        <w:shd w:val="clear" w:color="auto" w:fill="181818"/>
+        <w:spacing w:after="0" w:line="270" w:lineRule="atLeast"/>
+        <w:rPr>
+          <w:rFonts w:ascii="Menlo" w:eastAsia="Times New Roman" w:hAnsi="Menlo" w:cs="Menlo"/>
+          <w:color w:val="D6D6DD"/>
+          <w:kern w:val="0"/>
+          <w:sz w:val="18"/>
+          <w:szCs w:val="18"/>
+          <w14:ligatures w14:val="none"/>
+        </w:rPr>
+      </w:pPr>
+      <w:r>
+        <w:rPr>
+          <w:rFonts w:ascii="Menlo" w:eastAsia="Times New Roman" w:hAnsi="Menlo" w:cs="Menlo"/>
+          <w:color w:val="E394DC"/>
+          <w:kern w:val="0"/>
+          <w:sz w:val="18"/>
+          <w:szCs w:val="18"/>
+          <w14:ligatures w14:val="none"/>
+        </w:rPr>
+        <w:t>- Break down the problem step-by-step</w:t>
+      </w:r>
+    </w:p>
+    <w:p>
+      <w:pPr>
+        <w:shd w:val="clear" w:color="auto" w:fill="181818"/>
+        <w:spacing w:after="0" w:line="270" w:lineRule="atLeast"/>
+        <w:rPr>
+          <w:rFonts w:ascii="Menlo" w:eastAsia="Times New Roman" w:hAnsi="Menlo" w:cs="Menlo"/>
+          <w:color w:val="D6D6DD"/>
+          <w:kern w:val="0"/>
+          <w:sz w:val="18"/>
+          <w:szCs w:val="18"/>
+          <w14:ligatures w14:val="none"/>
+        </w:rPr>
+      </w:pPr>
+      <w:r>
+        <w:rPr>
+          <w:rFonts w:ascii="Menlo" w:eastAsia="Times New Roman" w:hAnsi="Menlo" w:cs="Menlo"/>
+          <w:color w:val="E394DC"/>
+          <w:kern w:val="0"/>
+          <w:sz w:val="18"/>
+          <w:szCs w:val="18"/>
+          <w14:ligatures w14:val="none"/>
+        </w:rPr>
+        <w:t>- Show your work clearly</w:t>
+      </w:r>
+    </w:p>
+    <w:p>
+      <w:pPr>
+        <w:shd w:val="clear" w:color="auto" w:fill="181818"/>
+        <w:spacing w:after="0" w:line="270" w:lineRule="atLeast"/>
+        <w:rPr>
+          <w:rFonts w:ascii="Menlo" w:eastAsia="Times New Roman" w:hAnsi="Menlo" w:cs="Menlo"/>
+          <w:color w:val="D6D6DD"/>
+          <w:kern w:val="0"/>
+          <w:sz w:val="18"/>
+          <w:szCs w:val="18"/>
+          <w14:ligatures w14:val="none"/>
+        </w:rPr>
+      </w:pPr>
+      <w:r>
+        <w:rPr>
+          <w:rFonts w:ascii="Menlo" w:eastAsia="Times New Roman" w:hAnsi="Menlo" w:cs="Menlo"/>
+          <w:color w:val="E394DC"/>
+          <w:kern w:val="0"/>
+          <w:sz w:val="18"/>
+          <w:szCs w:val="18"/>
+          <w14:ligatures w14:val="none"/>
+        </w:rPr>
+        <w:t>- Explain each step's reasoning</w:t>
+      </w:r>
+    </w:p>
+    <w:p>
+      <w:pPr>
+        <w:shd w:val="clear" w:color="auto" w:fill="181818"/>
+        <w:spacing w:after="0" w:line="270" w:lineRule="atLeast"/>
+        <w:rPr>
+          <w:rFonts w:ascii="Menlo" w:eastAsia="Times New Roman" w:hAnsi="Menlo" w:cs="Menlo"/>
+          <w:color w:val="D6D6DD"/>
+          <w:kern w:val="0"/>
+          <w:sz w:val="18"/>
+          <w:szCs w:val="18"/>
+          <w14:ligatures w14:val="none"/>
+        </w:rPr>
+      </w:pPr>
+      <w:r>
+        <w:rPr>
+          <w:rFonts w:ascii="Menlo" w:eastAsia="Times New Roman" w:hAnsi="Menlo" w:cs="Menlo"/>
+          <w:color w:val="E394DC"/>
+          <w:kern w:val="0"/>
+          <w:sz w:val="18"/>
+          <w:szCs w:val="18"/>
+          <w14:ligatures w14:val="none"/>
+        </w:rPr>
+        <w:t>- Verify the solution</w:t>
+      </w:r>
+    </w:p>
+    <w:p>
+      <w:pPr>
+        <w:shd w:val="clear" w:color="auto" w:fill="181818"/>
+        <w:spacing w:after="0" w:line="270" w:lineRule="atLeast"/>
+        <w:rPr>
+          <w:rFonts w:ascii="Menlo" w:eastAsia="Times New Roman" w:hAnsi="Menlo" w:cs="Menlo"/>
+          <w:color w:val="D6D6DD"/>
+          <w:kern w:val="0"/>
+          <w:sz w:val="18"/>
+          <w:szCs w:val="18"/>
+          <w14:ligatures w14:val="none"/>
+        </w:rPr>
+      </w:pPr>
+      <w:r>
+        <w:rPr>
+          <w:rFonts w:ascii="Menlo" w:eastAsia="Times New Roman" w:hAnsi="Menlo" w:cs="Menlo"/>
+          <w:color w:val="E394DC"/>
+          <w:kern w:val="0"/>
+          <w:sz w:val="18"/>
+          <w:szCs w:val="18"/>
+          <w14:ligatures w14:val="none"/>
+        </w:rPr>
+        <w:t>- Provide a final answer in a clear format</w:t>
+      </w:r>
+    </w:p>
+    <w:p>
+      <w:pPr>
+        <w:shd w:val="clear" w:color="auto" w:fill="181818"/>
+        <w:spacing w:after="0" w:line="270" w:lineRule="atLeast"/>
+        <w:rPr>
+          <w:rFonts w:ascii="Menlo" w:eastAsia="Times New Roman" w:hAnsi="Menlo" w:cs="Menlo"/>
+          <w:color w:val="D6D6DD"/>
+          <w:kern w:val="0"/>
+          <w:sz w:val="18"/>
+          <w:szCs w:val="18"/>
+          <w14:ligatures w14:val="none"/>
+        </w:rPr>
+      </w:pPr>
+    </w:p>
+    <w:p>
+      <w:pPr>
+        <w:shd w:val="clear" w:color="auto" w:fill="181818"/>
+        <w:spacing w:after="0" w:line="270" w:lineRule="atLeast"/>
+        <w:rPr>
+          <w:rFonts w:ascii="Menlo" w:eastAsia="Times New Roman" w:hAnsi="Menlo" w:cs="Menlo"/>
+          <w:color w:val="D6D6DD"/>
+          <w:kern w:val="0"/>
+          <w:sz w:val="18"/>
+          <w:szCs w:val="18"/>
+          <w14:ligatures w14:val="none"/>
+        </w:rPr>
+      </w:pPr>
+      <w:r>
+        <w:rPr>
+          <w:rFonts w:ascii="Menlo" w:eastAsia="Times New Roman" w:hAnsi="Menlo" w:cs="Menlo"/>
+          <w:color w:val="E394DC"/>
+          <w:kern w:val="0"/>
+          <w:sz w:val="18"/>
+          <w:szCs w:val="18"/>
+          <w14:ligatures w14:val="none"/>
+        </w:rPr>
+        <w:t>For rewriting and editing tasks:</w:t>
+      </w:r>
+    </w:p>
+    <w:p>
+      <w:pPr>
+        <w:shd w:val="clear" w:color="auto" w:fill="181818"/>
+        <w:spacing w:after="0" w:line="270" w:lineRule="atLeast"/>
+        <w:rPr>
+          <w:rFonts w:ascii="Menlo" w:eastAsia="Times New Roman" w:hAnsi="Menlo" w:cs="Menlo"/>
+          <w:color w:val="D6D6DD"/>
+          <w:kern w:val="0"/>
+          <w:sz w:val="18"/>
+          <w:szCs w:val="18"/>
+          <w14:ligatures w14:val="none"/>
+        </w:rPr>
+      </w:pPr>
+      <w:r>
+        <w:rPr>
+          <w:rFonts w:ascii="Menlo" w:eastAsia="Times New Roman" w:hAnsi="Menlo" w:cs="Menlo"/>
+          <w:color w:val="E394DC"/>
+          <w:kern w:val="0"/>
+          <w:sz w:val="18"/>
+          <w:szCs w:val="18"/>
+          <w14:ligatures w14:val="none"/>
+        </w:rPr>
+        <w:t>- Maintain the original message</w:t>
+      </w:r>
+    </w:p>
+    <w:p>
+      <w:pPr>
+        <w:shd w:val="clear" w:color="auto" w:fill="181818"/>
+        <w:spacing w:after="0" w:line="270" w:lineRule="atLeast"/>
+        <w:rPr>
+          <w:rFonts w:ascii="Menlo" w:eastAsia="Times New Roman" w:hAnsi="Menlo" w:cs="Menlo"/>
+          <w:color w:val="D6D6DD"/>
+          <w:kern w:val="0"/>
+          <w:sz w:val="18"/>
+          <w:szCs w:val="18"/>
+          <w14:ligatures w14:val="none"/>
+        </w:rPr>
+      </w:pPr>
+      <w:r>
+        <w:rPr>
+          <w:rFonts w:ascii="Menlo" w:eastAsia="Times New Roman" w:hAnsi="Menlo" w:cs="Menlo"/>
+          <w:color w:val="E394DC"/>
+          <w:kern w:val="0"/>
+          <w:sz w:val="18"/>
+          <w:szCs w:val="18"/>
+          <w14:ligatures w14:val="none"/>
+        </w:rPr>
+        <w:t>- Enhance clarity and professionalism</w:t>
+      </w:r>
+    </w:p>
+    <w:p>
+      <w:pPr>
+        <w:shd w:val="clear" w:color="auto" w:fill="181818"/>
+        <w:spacing w:after="0" w:line="270" w:lineRule="atLeast"/>
+        <w:rPr>
+          <w:rFonts w:ascii="Menlo" w:eastAsia="Times New Roman" w:hAnsi="Menlo" w:cs="Menlo"/>
+          <w:color w:val="D6D6DD"/>
+          <w:kern w:val="0"/>
+          <w:sz w:val="18"/>
+          <w:szCs w:val="18"/>
+          <w14:ligatures w14:val="none"/>
+        </w:rPr>
+      </w:pPr>
+      <w:r>
+        <w:rPr>
+          <w:rFonts w:ascii="Menlo" w:eastAsia="Times New Roman" w:hAnsi="Menlo" w:cs="Menlo"/>
+          <w:color w:val="E394DC"/>
+          <w:kern w:val="0"/>
+          <w:sz w:val="18"/>
+          <w:szCs w:val="18"/>
+          <w14:ligatures w14:val="none"/>
+        </w:rPr>
+        <w:t>- Use appropriate tone and vocabulary</w:t>
+      </w:r>
+    </w:p>
+    <w:p>
+      <w:pPr>
+        <w:shd w:val="clear" w:color="auto" w:fill="181818"/>
+        <w:spacing w:after="0" w:line="270" w:lineRule="atLeast"/>
+        <w:rPr>
+          <w:rFonts w:ascii="Menlo" w:eastAsia="Times New Roman" w:hAnsi="Menlo" w:cs="Menlo"/>
+          <w:color w:val="D6D6DD"/>
+          <w:kern w:val="0"/>
+          <w:sz w:val="18"/>
+          <w:szCs w:val="18"/>
+          <w14:ligatures w14:val="none"/>
+        </w:rPr>
+      </w:pPr>
+      <w:r>
+        <w:rPr>
+          <w:rFonts w:ascii="Menlo" w:eastAsia="Times New Roman" w:hAnsi="Menlo" w:cs="Menlo"/>
+          <w:color w:val="E394DC"/>
+          <w:kern w:val="0"/>
+          <w:sz w:val="18"/>
+          <w:szCs w:val="18"/>
+          <w14:ligatures w14:val="none"/>
+        </w:rPr>
+        <w:t>- Preserve key information</w:t>
+      </w:r>
+    </w:p>
+    <w:p>
+      <w:pPr>
+        <w:shd w:val="clear" w:color="auto" w:fill="181818"/>
+        <w:spacing w:after="0" w:line="270" w:lineRule="atLeast"/>
+        <w:rPr>
+          <w:rFonts w:ascii="Menlo" w:eastAsia="Times New Roman" w:hAnsi="Menlo" w:cs="Menlo"/>
+          <w:color w:val="D6D6DD"/>
+          <w:kern w:val="0"/>
+          <w:sz w:val="18"/>
+          <w:szCs w:val="18"/>
+          <w14:ligatures w14:val="none"/>
+        </w:rPr>
+      </w:pPr>
+      <w:r>
+        <w:rPr>
+          <w:rFonts w:ascii="Menlo" w:eastAsia="Times New Roman" w:hAnsi="Menlo" w:cs="Menlo"/>
+          <w:color w:val="E394DC"/>
+          <w:kern w:val="0"/>
+          <w:sz w:val="18"/>
+          <w:szCs w:val="18"/>
+          <w14:ligatures w14:val="none"/>
+        </w:rPr>
+        <w:t>- Show both original and revised versions</w:t>
+      </w:r>
+    </w:p>
+    <w:p>
+      <w:pPr>
+        <w:shd w:val="clear" w:color="auto" w:fill="181818"/>
+        <w:spacing w:after="0" w:line="270" w:lineRule="atLeast"/>
+        <w:rPr>
+          <w:rFonts w:ascii="Menlo" w:eastAsia="Times New Roman" w:hAnsi="Menlo" w:cs="Menlo"/>
+          <w:color w:val="D6D6DD"/>
+          <w:kern w:val="0"/>
+          <w:sz w:val="18"/>
+          <w:szCs w:val="18"/>
+          <w14:ligatures w14:val="none"/>
+        </w:rPr>
+      </w:pPr>
+    </w:p>
+    <w:p>
+      <w:pPr>
+        <w:shd w:val="clear" w:color="auto" w:fill="181818"/>
+        <w:spacing w:after="0" w:line="270" w:lineRule="atLeast"/>
+        <w:rPr>
+          <w:rFonts w:ascii="Menlo" w:eastAsia="Times New Roman" w:hAnsi="Menlo" w:cs="Menlo"/>
+          <w:color w:val="D6D6DD"/>
+          <w:kern w:val="0"/>
+          <w:sz w:val="18"/>
+          <w:szCs w:val="18"/>
+          <w14:ligatures w14:val="none"/>
+        </w:rPr>
+      </w:pPr>
+      <w:r>
+        <w:rPr>
+          <w:rFonts w:ascii="Menlo" w:eastAsia="Times New Roman" w:hAnsi="Menlo" w:cs="Menlo"/>
+          <w:color w:val="E394DC"/>
+          <w:kern w:val="0"/>
+          <w:sz w:val="18"/>
+          <w:szCs w:val="18"/>
+          <w14:ligatures w14:val="none"/>
+        </w:rPr>
+        <w:t>Always maintain a friendly, patient tone and check your response for accuracy and completeness before concluding.</w:t>
+      </w:r>
+    </w:p>
+    <w:p>
+      <w:pPr>
+        <w:shd w:val="clear" w:color="auto" w:fill="181818"/>
+        <w:spacing w:after="0" w:line="270" w:lineRule="atLeast"/>
+        <w:rPr>
+          <w:rFonts w:ascii="Menlo" w:eastAsia="Times New Roman" w:hAnsi="Menlo" w:cs="Menlo"/>
+          <w:color w:val="D6D6DD"/>
+          <w:kern w:val="0"/>
+          <w:sz w:val="18"/>
+          <w:szCs w:val="18"/>
+          <w14:ligatures w14:val="none"/>
+        </w:rPr>
+      </w:pPr>
+      <w:r>
+        <w:rPr>
+          <w:rFonts w:ascii="Menlo" w:eastAsia="Times New Roman" w:hAnsi="Menlo" w:cs="Menlo"/>
+          <w:color w:val="E394DC"/>
+          <w:kern w:val="0"/>
+          <w:sz w:val="18"/>
+          <w:szCs w:val="18"/>
+          <w14:ligatures w14:val="none"/>
+        </w:rPr>
+        <w:t>"""</w:t>
+      </w:r>
+    </w:p>
+    <w:p>
+      <w:pPr>
+        <w:tabs>
+          <w:tab w:val="left" w:pos="6696"/>
+        </w:tabs>
+      </w:pPr>
+      <w:r>
+        <w:lastRenderedPageBreak/>
+        <w:drawing>
+          <wp:inline distT="0" distB="0" distL="0" distR="0" wp14:anchorId="0B6BA527" wp14:editId="695B79E6">
+            <wp:extent cx="5943600" cy="3792855"/>
+            <wp:effectExtent l="0" t="0" r="0" b="4445"/>
+            <wp:docPr id="353737427" name="Picture 1" descr="A screenshot of a computer&#10;&#10;Description automatically generated"/>
+            <wp:cNvGraphicFramePr>
+              <a:graphicFrameLocks xmlns:a="http://schemas.openxmlformats.org/drawingml/2006/main" noChangeAspect="1"/>
+            </wp:cNvGraphicFramePr>
+            <a:graphic xmlns:a="http://schemas.openxmlformats.org/drawingml/2006/main">
+              <a:graphicData uri="http://schemas.openxmlformats.org/drawingml/2006/picture">
+                <pic:pic xmlns:pic="http://schemas.openxmlformats.org/drawingml/2006/picture">
+                  <pic:nvPicPr>
+                    <pic:cNvPr id="353737427" name="Picture 1" descr="A screenshot of a computer&#10;&#10;Description automatically generated"/>
+                    <pic:cNvPicPr/>
+                  </pic:nvPicPr>
+                  <pic:blipFill>
+                    <a:blip r:embed="rId9"/>
+                    <a:stretch>
+                      <a:fillRect/>
+                    </a:stretch>
+                  </pic:blipFill>
+                  <pic:spPr>
+                    <a:xfrm>
+                      <a:off x="0" y="0"/>
+                      <a:ext cx="5943600" cy="3792855"/>
+                    </a:xfrm>
+                    <a:prstGeom prst="rect">
+                      <a:avLst/>
+                    </a:prstGeom>
+                  </pic:spPr>
+                </pic:pic>
+              </a:graphicData>
+            </a:graphic>
+          </wp:inline>
+        </w:drawing>
+      </w:r>
+    </w:p>
+    <w:p>
+      <w:pPr>
+        <w:tabs>
+          <w:tab w:val="left" w:pos="6696"/>
+        </w:tabs>
+      </w:pPr>
+      <w:r>
+        <w:drawing>
+          <wp:inline distT="0" distB="0" distL="0" distR="0" wp14:anchorId="5E26C8FF" wp14:editId="433C8F9D">
+            <wp:extent cx="5943600" cy="3255645"/>
+            <wp:effectExtent l="0" t="0" r="0" b="0"/>
+            <wp:docPr id="1802889330" name="Picture 1" descr="A screenshot of a math problem&#10;&#10;Description automatically generated"/>
+            <wp:cNvGraphicFramePr>
+              <a:graphicFrameLocks xmlns:a="http://schemas.openxmlformats.org/drawingml/2006/main" noChangeAspect="1"/>
+            </wp:cNvGraphicFramePr>
+            <a:graphic xmlns:a="http://schemas.openxmlformats.org/drawingml/2006/main">
+              <a:graphicData uri="http://schemas.openxmlformats.org/drawingml/2006/picture">
+                <pic:pic xmlns:pic="http://schemas.openxmlformats.org/drawingml/2006/picture">
+                  <pic:nvPicPr>
+                    <pic:cNvPr id="1802889330" name="Picture 1" descr="A screenshot of a math problem&#10;&#10;Description automatically generated"/>
+                    <pic:cNvPicPr/>
+                  </pic:nvPicPr>
+                  <pic:blipFill>
+                    <a:blip r:embed="rId10"/>
+                    <a:stretch>
+                      <a:fillRect/>
+                    </a:stretch>
+                  </pic:blipFill>
+                  <pic:spPr>
+                    <a:xfrm>
+                      <a:off x="0" y="0"/>
+                      <a:ext cx="5943600" cy="3255645"/>
+                    </a:xfrm>
+                    <a:prstGeom prst="rect">
+                      <a:avLst/>
+                    </a:prstGeom>
+                  </pic:spPr>
+                </pic:pic>
+              </a:graphicData>
+            </a:graphic>
+          </wp:inline>
+        </w:drawing>
+      </w:r>
+      <w:r>
+        <w:t>After testing the questions after updating the prompt (only including a few screenshots), the answers are generally formatted better, always includes a summary at the end, provides more detailed reasoning, and uses analogies.</w:t>
       </w:r>
     </w:p>
     <w:sectPr>

</xml_diff>